<commit_message>
USER_GUIDE: embed 8 screenshots extracted from session transcript
Extracted the screenshots Khalid took during our end-to-end test from
the Claude Code transcript JSONL (14 inline base64 PNGs total). Mapped
8 of them to the guide's filenames; the other 5 placeholders weren't
captured during the session and remain TODO:

  Present:   02-dokploy-env-tab, 05-cp-idp-picker, 06-cp-entra-form,
             07-cp-idp-added, 09-sim-scim-nav, 11-sim-sync-success,
             12-sim-push-log, 13-cp-members-synced

  Still TODO (capture and re-run ./docs/build_user_guide.sh):
             01-homepage, 03-bootstrap-token-banner, 04-cp-idp-list,
             08-cp-scim-settings, 10-sim-add-target

guide/images/README.md updated with a status column showing which are
present vs TODO. DOCX is now 2.9 MB with the 8 images baked in.

Co-Authored-By: Claude Opus 4.7 (1M context) <noreply@anthropic.com>
</commit_message>
<xml_diff>
--- a/docs/USER_GUIDE.docx
+++ b/docs/USER_GUIDE.docx
@@ -44,7 +44,7 @@
         </w:p>
       </w:sdtContent>
     </w:sdt>
-    <w:bookmarkStart w:id="59" w:name="saml-scim-idp-simulator-user-guide"/>
+    <w:bookmarkStart w:id="83" w:name="saml-scim-idp-simulator-user-guide"/>
     <w:p>
       <w:pPr>
         <w:pStyle w:val="Heading1"/>
@@ -1263,7 +1263,7 @@
     </w:p>
     <w:bookmarkEnd w:id="15"/>
     <w:bookmarkEnd w:id="16"/>
-    <w:bookmarkStart w:id="20" w:name="enable-scim-on-the-simulator"/>
+    <w:bookmarkStart w:id="23" w:name="enable-scim-on-the-simulator"/>
     <w:p>
       <w:pPr>
         <w:pStyle w:val="Heading2"/>
@@ -1280,7 +1280,7 @@
         <w:t xml:space="preserve">By default the simulator only does SAML. SCIM is opt-in.</w:t>
       </w:r>
     </w:p>
-    <w:bookmarkStart w:id="17" w:name="the-clean-path"/>
+    <w:bookmarkStart w:id="20" w:name="the-clean-path"/>
     <w:p>
       <w:pPr>
         <w:pStyle w:val="Heading3"/>
@@ -1372,6 +1372,355 @@
       </w:r>
       <w:r>
         <w:t xml:space="preserve">).</w:t>
+      </w:r>
+    </w:p>
+    <w:p>
+      <w:pPr>
+        <w:pStyle w:val="CaptionedFigure"/>
+      </w:pPr>
+      <w:r>
+        <w:drawing>
+          <wp:inline>
+            <wp:extent cx="5334000" cy="2522982"/>
+            <wp:effectExtent b="0" l="0" r="0" t="0"/>
+            <wp:docPr descr="Dokploy Environment tab with ENABLE_SCIM=true" title="" id="18" name="Picture"/>
+            <a:graphic>
+              <a:graphicData uri="http://schemas.openxmlformats.org/drawingml/2006/picture">
+                <pic:pic>
+                  <pic:nvPicPr>
+                    <pic:cNvPr descr="guide/images/02-dokploy-env-tab.png" id="19" name="Picture"/>
+                    <pic:cNvPicPr>
+                      <a:picLocks noChangeArrowheads="1" noChangeAspect="1"/>
+                    </pic:cNvPicPr>
+                  </pic:nvPicPr>
+                  <pic:blipFill>
+                    <a:blip r:embed="rId17"/>
+                    <a:stretch>
+                      <a:fillRect/>
+                    </a:stretch>
+                  </pic:blipFill>
+                  <pic:spPr bwMode="auto">
+                    <a:xfrm>
+                      <a:off x="0" y="0"/>
+                      <a:ext cx="5334000" cy="2522982"/>
+                    </a:xfrm>
+                    <a:prstGeom prst="rect">
+                      <a:avLst/>
+                    </a:prstGeom>
+                    <a:noFill/>
+                    <a:ln w="9525">
+                      <a:noFill/>
+                      <a:headEnd/>
+                      <a:tailEnd/>
+                    </a:ln>
+                  </pic:spPr>
+                </pic:pic>
+              </a:graphicData>
+            </a:graphic>
+          </wp:inline>
+        </w:drawing>
+      </w:r>
+    </w:p>
+    <w:p>
+      <w:pPr>
+        <w:pStyle w:val="ImageCaption"/>
+      </w:pPr>
+      <w:r>
+        <w:t xml:space="preserve">Dokploy Environment tab with ENABLE_SCIM=true</w:t>
+      </w:r>
+    </w:p>
+    <w:bookmarkEnd w:id="20"/>
+    <w:bookmarkStart w:id="21" w:name="Xf5249964d51ea5838faeb24879df5fed1880961"/>
+    <w:p>
+      <w:pPr>
+        <w:pStyle w:val="Heading3"/>
+      </w:pPr>
+      <w:r>
+        <w:t xml:space="preserve">4.2 The fallback (if your Dokploy doesn’t propagate env vars)</w:t>
+      </w:r>
+    </w:p>
+    <w:p>
+      <w:pPr>
+        <w:pStyle w:val="FirstParagraph"/>
+      </w:pPr>
+      <w:r>
+        <w:t xml:space="preserve">Some Dokploy versions don’t pass Environment-tab values through docker-compose’s variable substitution context. If after redeploy you still see</w:t>
+      </w:r>
+      <w:r>
+        <w:t xml:space="preserve"> </w:t>
+      </w:r>
+      <w:r>
+        <w:rPr>
+          <w:rStyle w:val="VerbatimChar"/>
+        </w:rPr>
+        <w:t xml:space="preserve">SCIM disabled</w:t>
+      </w:r>
+      <w:r>
+        <w:t xml:space="preserve"> </w:t>
+      </w:r>
+      <w:r>
+        <w:t xml:space="preserve">in the logs, use this fallback:</w:t>
+      </w:r>
+    </w:p>
+    <w:p>
+      <w:pPr>
+        <w:numPr>
+          <w:ilvl w:val="0"/>
+          <w:numId w:val="1005"/>
+        </w:numPr>
+      </w:pPr>
+      <w:r>
+        <w:t xml:space="preserve">Open the container terminal in Dokploy (Docker sidebar → your container → Terminal)</w:t>
+      </w:r>
+    </w:p>
+    <w:p>
+      <w:pPr>
+        <w:numPr>
+          <w:ilvl w:val="0"/>
+          <w:numId w:val="1005"/>
+        </w:numPr>
+      </w:pPr>
+      <w:r>
+        <w:t xml:space="preserve">Run:</w:t>
+      </w:r>
+    </w:p>
+    <w:p>
+      <w:pPr>
+        <w:pStyle w:val="SourceCode"/>
+        <w:numPr>
+          <w:ilvl w:val="0"/>
+          <w:numId w:val="1000"/>
+        </w:numPr>
+      </w:pPr>
+      <w:r>
+        <w:rPr>
+          <w:rStyle w:val="FunctionTok"/>
+        </w:rPr>
+        <w:t xml:space="preserve">mkdir</w:t>
+      </w:r>
+      <w:r>
+        <w:rPr>
+          <w:rStyle w:val="NormalTok"/>
+        </w:rPr>
+        <w:t xml:space="preserve"> </w:t>
+      </w:r>
+      <w:r>
+        <w:rPr>
+          <w:rStyle w:val="AttributeTok"/>
+        </w:rPr>
+        <w:t xml:space="preserve">-p</w:t>
+      </w:r>
+      <w:r>
+        <w:rPr>
+          <w:rStyle w:val="NormalTok"/>
+        </w:rPr>
+        <w:t xml:space="preserve"> /app/data </w:t>
+      </w:r>
+      <w:r>
+        <w:rPr>
+          <w:rStyle w:val="KeywordTok"/>
+        </w:rPr>
+        <w:t xml:space="preserve">&amp;&amp;</w:t>
+      </w:r>
+      <w:r>
+        <w:rPr>
+          <w:rStyle w:val="NormalTok"/>
+        </w:rPr>
+        <w:t xml:space="preserve"> </w:t>
+      </w:r>
+      <w:r>
+        <w:rPr>
+          <w:rStyle w:val="FunctionTok"/>
+        </w:rPr>
+        <w:t xml:space="preserve">touch</w:t>
+      </w:r>
+      <w:r>
+        <w:rPr>
+          <w:rStyle w:val="NormalTok"/>
+        </w:rPr>
+        <w:t xml:space="preserve"> /app/data/.enable-scim</w:t>
+      </w:r>
+    </w:p>
+    <w:p>
+      <w:pPr>
+        <w:numPr>
+          <w:ilvl w:val="0"/>
+          <w:numId w:val="1005"/>
+        </w:numPr>
+      </w:pPr>
+      <w:r>
+        <w:t xml:space="preserve">Restart the container</w:t>
+      </w:r>
+    </w:p>
+    <w:p>
+      <w:pPr>
+        <w:pStyle w:val="FirstParagraph"/>
+      </w:pPr>
+      <w:r>
+        <w:t xml:space="preserve">The simulator checks for this marker file at boot and turns SCIM on. The file lives on the persisted</w:t>
+      </w:r>
+      <w:r>
+        <w:t xml:space="preserve"> </w:t>
+      </w:r>
+      <w:r>
+        <w:rPr>
+          <w:rStyle w:val="VerbatimChar"/>
+        </w:rPr>
+        <w:t xml:space="preserve">saml_idp_data</w:t>
+      </w:r>
+      <w:r>
+        <w:t xml:space="preserve"> </w:t>
+      </w:r>
+      <w:r>
+        <w:t xml:space="preserve">volume so it survives future redeploys.</w:t>
+      </w:r>
+    </w:p>
+    <w:bookmarkEnd w:id="21"/>
+    <w:bookmarkStart w:id="22" w:name="read-the-bootstrap-token"/>
+    <w:p>
+      <w:pPr>
+        <w:pStyle w:val="Heading3"/>
+      </w:pPr>
+      <w:r>
+        <w:t xml:space="preserve">4.3 Read the bootstrap token</w:t>
+      </w:r>
+    </w:p>
+    <w:p>
+      <w:pPr>
+        <w:pStyle w:val="FirstParagraph"/>
+      </w:pPr>
+      <w:r>
+        <w:t xml:space="preserve">On first boot with SCIM enabled, the simulator auto-generates a default inbound bearer token. You’ll see this block in the Dokploy logs:</w:t>
+      </w:r>
+    </w:p>
+    <w:p>
+      <w:pPr>
+        <w:pStyle w:val="SourceCode"/>
+      </w:pPr>
+      <w:r>
+        <w:rPr>
+          <w:rStyle w:val="VerbatimChar"/>
+        </w:rPr>
+        <w:t xml:space="preserve">======================================================================</w:t>
+      </w:r>
+      <w:r>
+        <w:br/>
+      </w:r>
+      <w:r>
+        <w:rPr>
+          <w:rStyle w:val="VerbatimChar"/>
+        </w:rPr>
+        <w:t xml:space="preserve">SCIM default inbound bearer token (auto-generated)</w:t>
+      </w:r>
+      <w:r>
+        <w:br/>
+      </w:r>
+      <w:r>
+        <w:rPr>
+          <w:rStyle w:val="VerbatimChar"/>
+        </w:rPr>
+        <w:t xml:space="preserve">  Token: &lt;43-character-token-string&gt;</w:t>
+      </w:r>
+      <w:r>
+        <w:br/>
+      </w:r>
+      <w:r>
+        <w:rPr>
+          <w:rStyle w:val="VerbatimChar"/>
+        </w:rPr>
+        <w:t xml:space="preserve">  Bootstrap file: /app/data/.scim-bootstrap-token</w:t>
+      </w:r>
+      <w:r>
+        <w:br/>
+      </w:r>
+      <w:r>
+        <w:rPr>
+          <w:rStyle w:val="VerbatimChar"/>
+        </w:rPr>
+        <w:t xml:space="preserve">  Use as: Authorization: Bearer &lt;token&gt;</w:t>
+      </w:r>
+      <w:r>
+        <w:br/>
+      </w:r>
+      <w:r>
+        <w:rPr>
+          <w:rStyle w:val="VerbatimChar"/>
+        </w:rPr>
+        <w:t xml:space="preserve">  Manage at /admin/scim/inbound-tokens</w:t>
+      </w:r>
+      <w:r>
+        <w:br/>
+      </w:r>
+      <w:r>
+        <w:rPr>
+          <w:rStyle w:val="VerbatimChar"/>
+        </w:rPr>
+        <w:t xml:space="preserve">======================================================================</w:t>
+      </w:r>
+      <w:r>
+        <w:br/>
+      </w:r>
+      <w:r>
+        <w:rPr>
+          <w:rStyle w:val="VerbatimChar"/>
+        </w:rPr>
+        <w:t xml:space="preserve">SCIM endpoints enabled at /scim/v2 (server) and /admin/scim (admin UI)</w:t>
+      </w:r>
+    </w:p>
+    <w:p>
+      <w:pPr>
+        <w:pStyle w:val="FirstParagraph"/>
+      </w:pPr>
+      <w:r>
+        <w:rPr>
+          <w:b/>
+          <w:bCs/>
+        </w:rPr>
+        <w:t xml:space="preserve">Copy that token</w:t>
+      </w:r>
+      <w:r>
+        <w:t xml:space="preserve"> </w:t>
+      </w:r>
+      <w:r>
+        <w:t xml:space="preserve">— you’ll need it later for the inbound side (or if you want external Entra/Okta to push to you).</w:t>
+      </w:r>
+    </w:p>
+    <w:p>
+      <w:pPr>
+        <w:pStyle w:val="BodyText"/>
+      </w:pPr>
+      <w:r>
+        <w:t xml:space="preserve">The token is also written to</w:t>
+      </w:r>
+      <w:r>
+        <w:t xml:space="preserve"> </w:t>
+      </w:r>
+      <w:r>
+        <w:rPr>
+          <w:rStyle w:val="VerbatimChar"/>
+        </w:rPr>
+        <w:t xml:space="preserve">/app/data/.scim-bootstrap-token</w:t>
+      </w:r>
+      <w:r>
+        <w:t xml:space="preserve"> </w:t>
+      </w:r>
+      <w:r>
+        <w:t xml:space="preserve">and shown in a banner the first time you visit</w:t>
+      </w:r>
+      <w:r>
+        <w:t xml:space="preserve"> </w:t>
+      </w:r>
+      <w:r>
+        <w:rPr>
+          <w:rStyle w:val="VerbatimChar"/>
+        </w:rPr>
+        <w:t xml:space="preserve">/admin/scim/</w:t>
+      </w:r>
+      <w:r>
+        <w:t xml:space="preserve"> </w:t>
+      </w:r>
+      <w:r>
+        <w:t xml:space="preserve">in the admin UI.</w:t>
       </w:r>
     </w:p>
     <w:tbl>
@@ -1393,7 +1742,7 @@
               <w:jc w:val="center"/>
             </w:pPr>
             <w:r>
-              <w:t xml:space="preserve">Dokploy Environment tab with ENABLE_SCIM=true</w:t>
+              <w:t xml:space="preserve">SCIM Dashboard bootstrap-token banner</w:t>
             </w:r>
           </w:p>
         </w:tc>
@@ -1404,17 +1753,42 @@
         <w:pStyle w:val="ImageCaption"/>
       </w:pPr>
       <w:r>
-        <w:t xml:space="preserve">Dokploy Environment tab with ENABLE_SCIM=true</w:t>
-      </w:r>
-    </w:p>
-    <w:bookmarkEnd w:id="17"/>
-    <w:bookmarkStart w:id="18" w:name="Xf5249964d51ea5838faeb24879df5fed1880961"/>
+        <w:t xml:space="preserve">SCIM Dashboard bootstrap-token banner</w:t>
+      </w:r>
+    </w:p>
+    <w:p>
+      <w:r>
+        <w:pict>
+          <v:rect style="width:0;height:1.5pt" o:hralign="center" o:hrstd="t" o:hr="t"/>
+        </w:pict>
+      </w:r>
+    </w:p>
+    <w:bookmarkEnd w:id="22"/>
+    <w:bookmarkEnd w:id="23"/>
+    <w:bookmarkStart w:id="37" w:name="X37c296b42b65d047205523862445c6ae014b1a3"/>
+    <w:p>
+      <w:pPr>
+        <w:pStyle w:val="Heading2"/>
+      </w:pPr>
+      <w:r>
+        <w:t xml:space="preserve">5. Configure Check Point SASE — the inbound side</w:t>
+      </w:r>
+    </w:p>
+    <w:p>
+      <w:pPr>
+        <w:pStyle w:val="FirstParagraph"/>
+      </w:pPr>
+      <w:r>
+        <w:t xml:space="preserve">Now configure Check Point SASE to give you a SCIM endpoint + token that the simulator will push to.</w:t>
+      </w:r>
+    </w:p>
+    <w:bookmarkStart w:id="24" w:name="open-identity-providers"/>
     <w:p>
       <w:pPr>
         <w:pStyle w:val="Heading3"/>
       </w:pPr>
       <w:r>
-        <w:t xml:space="preserve">4.2 The fallback (if your Dokploy doesn’t propagate env vars)</w:t>
+        <w:t xml:space="preserve">5.1 Open Identity Providers</w:t>
       </w:r>
     </w:p>
     <w:p>
@@ -1422,283 +1796,19 @@
         <w:pStyle w:val="FirstParagraph"/>
       </w:pPr>
       <w:r>
-        <w:t xml:space="preserve">Some Dokploy versions don’t pass Environment-tab values through docker-compose’s variable substitution context. If after redeploy you still see</w:t>
-      </w:r>
-      <w:r>
-        <w:t xml:space="preserve"> </w:t>
-      </w:r>
-      <w:r>
-        <w:rPr>
-          <w:rStyle w:val="VerbatimChar"/>
-        </w:rPr>
-        <w:t xml:space="preserve">SCIM disabled</w:t>
-      </w:r>
-      <w:r>
-        <w:t xml:space="preserve"> </w:t>
-      </w:r>
-      <w:r>
-        <w:t xml:space="preserve">in the logs, use this fallback:</w:t>
-      </w:r>
-    </w:p>
-    <w:p>
-      <w:pPr>
-        <w:numPr>
-          <w:ilvl w:val="0"/>
-          <w:numId w:val="1005"/>
-        </w:numPr>
-      </w:pPr>
-      <w:r>
-        <w:t xml:space="preserve">Open the container terminal in Dokploy (Docker sidebar → your container → Terminal)</w:t>
-      </w:r>
-    </w:p>
-    <w:p>
-      <w:pPr>
-        <w:numPr>
-          <w:ilvl w:val="0"/>
-          <w:numId w:val="1005"/>
-        </w:numPr>
-      </w:pPr>
-      <w:r>
-        <w:t xml:space="preserve">Run:</w:t>
-      </w:r>
-    </w:p>
-    <w:p>
-      <w:pPr>
-        <w:pStyle w:val="SourceCode"/>
-        <w:numPr>
-          <w:ilvl w:val="0"/>
-          <w:numId w:val="1000"/>
-        </w:numPr>
-      </w:pPr>
-      <w:r>
-        <w:rPr>
-          <w:rStyle w:val="FunctionTok"/>
-        </w:rPr>
-        <w:t xml:space="preserve">mkdir</w:t>
-      </w:r>
-      <w:r>
-        <w:rPr>
-          <w:rStyle w:val="NormalTok"/>
-        </w:rPr>
-        <w:t xml:space="preserve"> </w:t>
-      </w:r>
-      <w:r>
-        <w:rPr>
-          <w:rStyle w:val="AttributeTok"/>
-        </w:rPr>
-        <w:t xml:space="preserve">-p</w:t>
-      </w:r>
-      <w:r>
-        <w:rPr>
-          <w:rStyle w:val="NormalTok"/>
-        </w:rPr>
-        <w:t xml:space="preserve"> /app/data </w:t>
-      </w:r>
-      <w:r>
-        <w:rPr>
-          <w:rStyle w:val="KeywordTok"/>
-        </w:rPr>
-        <w:t xml:space="preserve">&amp;&amp;</w:t>
-      </w:r>
-      <w:r>
-        <w:rPr>
-          <w:rStyle w:val="NormalTok"/>
-        </w:rPr>
-        <w:t xml:space="preserve"> </w:t>
-      </w:r>
-      <w:r>
-        <w:rPr>
-          <w:rStyle w:val="FunctionTok"/>
-        </w:rPr>
-        <w:t xml:space="preserve">touch</w:t>
-      </w:r>
-      <w:r>
-        <w:rPr>
-          <w:rStyle w:val="NormalTok"/>
-        </w:rPr>
-        <w:t xml:space="preserve"> /app/data/.enable-scim</w:t>
-      </w:r>
-    </w:p>
-    <w:p>
-      <w:pPr>
-        <w:numPr>
-          <w:ilvl w:val="0"/>
-          <w:numId w:val="1005"/>
-        </w:numPr>
-      </w:pPr>
-      <w:r>
-        <w:t xml:space="preserve">Restart the container</w:t>
-      </w:r>
-    </w:p>
-    <w:p>
-      <w:pPr>
-        <w:pStyle w:val="FirstParagraph"/>
-      </w:pPr>
-      <w:r>
-        <w:t xml:space="preserve">The simulator checks for this marker file at boot and turns SCIM on. The file lives on the persisted</w:t>
-      </w:r>
-      <w:r>
-        <w:t xml:space="preserve"> </w:t>
-      </w:r>
-      <w:r>
-        <w:rPr>
-          <w:rStyle w:val="VerbatimChar"/>
-        </w:rPr>
-        <w:t xml:space="preserve">saml_idp_data</w:t>
-      </w:r>
-      <w:r>
-        <w:t xml:space="preserve"> </w:t>
-      </w:r>
-      <w:r>
-        <w:t xml:space="preserve">volume so it survives future redeploys.</w:t>
-      </w:r>
-    </w:p>
-    <w:bookmarkEnd w:id="18"/>
-    <w:bookmarkStart w:id="19" w:name="read-the-bootstrap-token"/>
-    <w:p>
-      <w:pPr>
-        <w:pStyle w:val="Heading3"/>
-      </w:pPr>
-      <w:r>
-        <w:t xml:space="preserve">4.3 Read the bootstrap token</w:t>
-      </w:r>
-    </w:p>
-    <w:p>
-      <w:pPr>
-        <w:pStyle w:val="FirstParagraph"/>
-      </w:pPr>
-      <w:r>
-        <w:t xml:space="preserve">On first boot with SCIM enabled, the simulator auto-generates a default inbound bearer token. You’ll see this block in the Dokploy logs:</w:t>
-      </w:r>
-    </w:p>
-    <w:p>
-      <w:pPr>
-        <w:pStyle w:val="SourceCode"/>
-      </w:pPr>
-      <w:r>
-        <w:rPr>
-          <w:rStyle w:val="VerbatimChar"/>
-        </w:rPr>
-        <w:t xml:space="preserve">======================================================================</w:t>
-      </w:r>
-      <w:r>
-        <w:br/>
-      </w:r>
-      <w:r>
-        <w:rPr>
-          <w:rStyle w:val="VerbatimChar"/>
-        </w:rPr>
-        <w:t xml:space="preserve">SCIM default inbound bearer token (auto-generated)</w:t>
-      </w:r>
-      <w:r>
-        <w:br/>
-      </w:r>
-      <w:r>
-        <w:rPr>
-          <w:rStyle w:val="VerbatimChar"/>
-        </w:rPr>
-        <w:t xml:space="preserve">  Token: &lt;43-character-token-string&gt;</w:t>
-      </w:r>
-      <w:r>
-        <w:br/>
-      </w:r>
-      <w:r>
-        <w:rPr>
-          <w:rStyle w:val="VerbatimChar"/>
-        </w:rPr>
-        <w:t xml:space="preserve">  Bootstrap file: /app/data/.scim-bootstrap-token</w:t>
-      </w:r>
-      <w:r>
-        <w:br/>
-      </w:r>
-      <w:r>
-        <w:rPr>
-          <w:rStyle w:val="VerbatimChar"/>
-        </w:rPr>
-        <w:t xml:space="preserve">  Use as: Authorization: Bearer &lt;token&gt;</w:t>
-      </w:r>
-      <w:r>
-        <w:br/>
-      </w:r>
-      <w:r>
-        <w:rPr>
-          <w:rStyle w:val="VerbatimChar"/>
-        </w:rPr>
-        <w:t xml:space="preserve">  Manage at /admin/scim/inbound-tokens</w:t>
-      </w:r>
-      <w:r>
-        <w:br/>
-      </w:r>
-      <w:r>
-        <w:rPr>
-          <w:rStyle w:val="VerbatimChar"/>
-        </w:rPr>
-        <w:t xml:space="preserve">======================================================================</w:t>
-      </w:r>
-      <w:r>
-        <w:br/>
-      </w:r>
-      <w:r>
-        <w:rPr>
-          <w:rStyle w:val="VerbatimChar"/>
-        </w:rPr>
-        <w:t xml:space="preserve">SCIM endpoints enabled at /scim/v2 (server) and /admin/scim (admin UI)</w:t>
-      </w:r>
-    </w:p>
-    <w:p>
-      <w:pPr>
-        <w:pStyle w:val="FirstParagraph"/>
+        <w:t xml:space="preserve">In the Check Point SASE admin portal:</w:t>
+      </w:r>
+    </w:p>
+    <w:p>
+      <w:pPr>
+        <w:pStyle w:val="BodyText"/>
       </w:pPr>
       <w:r>
         <w:rPr>
           <w:b/>
           <w:bCs/>
         </w:rPr>
-        <w:t xml:space="preserve">Copy that token</w:t>
-      </w:r>
-      <w:r>
-        <w:t xml:space="preserve"> </w:t>
-      </w:r>
-      <w:r>
-        <w:t xml:space="preserve">— you’ll need it later for the inbound side (or if you want external Entra/Okta to push to you).</w:t>
-      </w:r>
-    </w:p>
-    <w:p>
-      <w:pPr>
-        <w:pStyle w:val="BodyText"/>
-      </w:pPr>
-      <w:r>
-        <w:t xml:space="preserve">The token is also written to</w:t>
-      </w:r>
-      <w:r>
-        <w:t xml:space="preserve"> </w:t>
-      </w:r>
-      <w:r>
-        <w:rPr>
-          <w:rStyle w:val="VerbatimChar"/>
-        </w:rPr>
-        <w:t xml:space="preserve">/app/data/.scim-bootstrap-token</w:t>
-      </w:r>
-      <w:r>
-        <w:t xml:space="preserve"> </w:t>
-      </w:r>
-      <w:r>
-        <w:t xml:space="preserve">and shown in a banner the first time you visit</w:t>
-      </w:r>
-      <w:r>
-        <w:t xml:space="preserve"> </w:t>
-      </w:r>
-      <w:r>
-        <w:rPr>
-          <w:rStyle w:val="VerbatimChar"/>
-        </w:rPr>
-        <w:t xml:space="preserve">/admin/scim/</w:t>
-      </w:r>
-      <w:r>
-        <w:t xml:space="preserve"> </w:t>
-      </w:r>
-      <w:r>
-        <w:t xml:space="preserve">in the admin UI.</w:t>
+        <w:t xml:space="preserve">Settings → Identity Providers → + Add Provider</w:t>
       </w:r>
     </w:p>
     <w:tbl>
@@ -1720,7 +1830,7 @@
               <w:jc w:val="center"/>
             </w:pPr>
             <w:r>
-              <w:t xml:space="preserve">SCIM Dashboard bootstrap-token banner</w:t>
+              <w:t xml:space="preserve">Check Point SASE Identity Providers page</w:t>
             </w:r>
           </w:p>
         </w:tc>
@@ -1731,99 +1841,11 @@
         <w:pStyle w:val="ImageCaption"/>
       </w:pPr>
       <w:r>
-        <w:t xml:space="preserve">SCIM Dashboard bootstrap-token banner</w:t>
-      </w:r>
-    </w:p>
-    <w:p>
-      <w:r>
-        <w:pict>
-          <v:rect style="width:0;height:1.5pt" o:hralign="center" o:hrstd="t" o:hr="t"/>
-        </w:pict>
-      </w:r>
-    </w:p>
-    <w:bookmarkEnd w:id="19"/>
-    <w:bookmarkEnd w:id="20"/>
-    <w:bookmarkStart w:id="25" w:name="X37c296b42b65d047205523862445c6ae014b1a3"/>
-    <w:p>
-      <w:pPr>
-        <w:pStyle w:val="Heading2"/>
-      </w:pPr>
-      <w:r>
-        <w:t xml:space="preserve">5. Configure Check Point SASE — the inbound side</w:t>
-      </w:r>
-    </w:p>
-    <w:p>
-      <w:pPr>
-        <w:pStyle w:val="FirstParagraph"/>
-      </w:pPr>
-      <w:r>
-        <w:t xml:space="preserve">Now configure Check Point SASE to give you a SCIM endpoint + token that the simulator will push to.</w:t>
-      </w:r>
-    </w:p>
-    <w:bookmarkStart w:id="21" w:name="open-identity-providers"/>
-    <w:p>
-      <w:pPr>
-        <w:pStyle w:val="Heading3"/>
-      </w:pPr>
-      <w:r>
-        <w:t xml:space="preserve">5.1 Open Identity Providers</w:t>
-      </w:r>
-    </w:p>
-    <w:p>
-      <w:pPr>
-        <w:pStyle w:val="FirstParagraph"/>
-      </w:pPr>
-      <w:r>
-        <w:t xml:space="preserve">In the Check Point SASE admin portal:</w:t>
-      </w:r>
-    </w:p>
-    <w:p>
-      <w:pPr>
-        <w:pStyle w:val="BodyText"/>
-      </w:pPr>
-      <w:r>
-        <w:rPr>
-          <w:b/>
-          <w:bCs/>
-        </w:rPr>
-        <w:t xml:space="preserve">Settings → Identity Providers → + Add Provider</w:t>
-      </w:r>
-    </w:p>
-    <w:tbl>
-      <w:tblPr>
-        <w:tblStyle w:val="FigureTable"/>
-        <w:tblW w:type="auto" w:w="0"/>
-        <w:jc w:val="center"/>
-        <w:tblLook w:firstRow="0" w:lastRow="0" w:firstColumn="0" w:lastColumn="0"/>
-      </w:tblPr>
-      <w:tblGrid>
-        <w:gridCol w:w="7920"/>
-      </w:tblGrid>
-      <w:tr>
-        <w:tc>
-          <w:tcPr/>
-          <w:p>
-            <w:pPr>
-              <w:pStyle w:val="Compact"/>
-              <w:jc w:val="center"/>
-            </w:pPr>
-            <w:r>
-              <w:t xml:space="preserve">Check Point SASE Identity Providers page</w:t>
-            </w:r>
-          </w:p>
-        </w:tc>
-      </w:tr>
-    </w:tbl>
-    <w:p>
-      <w:pPr>
-        <w:pStyle w:val="ImageCaption"/>
-      </w:pPr>
-      <w:r>
         <w:t xml:space="preserve">Check Point SASE Identity Providers page</w:t>
       </w:r>
     </w:p>
-    <w:bookmarkEnd w:id="21"/>
-    <w:bookmarkStart w:id="22" w:name="pick-microsoft-entra-id"/>
+    <w:bookmarkEnd w:id="24"/>
+    <w:bookmarkStart w:id="28" w:name="pick-microsoft-entra-id"/>
     <w:p>
       <w:pPr>
         <w:pStyle w:val="Heading3"/>
@@ -1974,31 +1996,53 @@
         <w:t xml:space="preserve">.</w:t>
       </w:r>
     </w:p>
-    <w:tbl>
-      <w:tblPr>
-        <w:tblStyle w:val="FigureTable"/>
-        <w:tblW w:type="auto" w:w="0"/>
-        <w:jc w:val="center"/>
-        <w:tblLook w:firstRow="0" w:lastRow="0" w:firstColumn="0" w:lastColumn="0"/>
-      </w:tblPr>
-      <w:tblGrid>
-        <w:gridCol w:w="7920"/>
-      </w:tblGrid>
-      <w:tr>
-        <w:tc>
-          <w:tcPr/>
-          <w:p>
-            <w:pPr>
-              <w:pStyle w:val="Compact"/>
-              <w:jc w:val="center"/>
-            </w:pPr>
-            <w:r>
-              <w:t xml:space="preserve">Add identity provider picker with Entra ID highlighted</w:t>
-            </w:r>
-          </w:p>
-        </w:tc>
-      </w:tr>
-    </w:tbl>
+    <w:p>
+      <w:pPr>
+        <w:pStyle w:val="CaptionedFigure"/>
+      </w:pPr>
+      <w:r>
+        <w:drawing>
+          <wp:inline>
+            <wp:extent cx="5334000" cy="2688336"/>
+            <wp:effectExtent b="0" l="0" r="0" t="0"/>
+            <wp:docPr descr="Add identity provider picker with Entra ID highlighted" title="" id="26" name="Picture"/>
+            <a:graphic>
+              <a:graphicData uri="http://schemas.openxmlformats.org/drawingml/2006/picture">
+                <pic:pic>
+                  <pic:nvPicPr>
+                    <pic:cNvPr descr="guide/images/05-cp-idp-picker.png" id="27" name="Picture"/>
+                    <pic:cNvPicPr>
+                      <a:picLocks noChangeArrowheads="1" noChangeAspect="1"/>
+                    </pic:cNvPicPr>
+                  </pic:nvPicPr>
+                  <pic:blipFill>
+                    <a:blip r:embed="rId25"/>
+                    <a:stretch>
+                      <a:fillRect/>
+                    </a:stretch>
+                  </pic:blipFill>
+                  <pic:spPr bwMode="auto">
+                    <a:xfrm>
+                      <a:off x="0" y="0"/>
+                      <a:ext cx="5334000" cy="2688336"/>
+                    </a:xfrm>
+                    <a:prstGeom prst="rect">
+                      <a:avLst/>
+                    </a:prstGeom>
+                    <a:noFill/>
+                    <a:ln w="9525">
+                      <a:noFill/>
+                      <a:headEnd/>
+                      <a:tailEnd/>
+                    </a:ln>
+                  </pic:spPr>
+                </pic:pic>
+              </a:graphicData>
+            </a:graphic>
+          </wp:inline>
+        </w:drawing>
+      </w:r>
+    </w:p>
     <w:p>
       <w:pPr>
         <w:pStyle w:val="ImageCaption"/>
@@ -2058,8 +2102,8 @@
         <w:t xml:space="preserve">option. The simulator will pretend to be Entra ID — Check Point doesn’t actually verify the Entra credentials before generating the SCIM endpoint, so this works even without a real Entra tenant.</w:t>
       </w:r>
     </w:p>
-    <w:bookmarkEnd w:id="22"/>
-    <w:bookmarkStart w:id="23" w:name="fill-in-the-form-with-dummy-values"/>
+    <w:bookmarkEnd w:id="28"/>
+    <w:bookmarkStart w:id="32" w:name="fill-in-the-form-with-dummy-values"/>
     <w:p>
       <w:pPr>
         <w:pStyle w:val="Heading3"/>
@@ -2298,6 +2342,332 @@
         <w:t xml:space="preserve">.</w:t>
       </w:r>
     </w:p>
+    <w:p>
+      <w:pPr>
+        <w:pStyle w:val="CaptionedFigure"/>
+      </w:pPr>
+      <w:r>
+        <w:drawing>
+          <wp:inline>
+            <wp:extent cx="5334000" cy="3227070"/>
+            <wp:effectExtent b="0" l="0" r="0" t="0"/>
+            <wp:docPr descr="Microsoft Entra ID form with dummy values + SCIM Integration checked" title="" id="30" name="Picture"/>
+            <a:graphic>
+              <a:graphicData uri="http://schemas.openxmlformats.org/drawingml/2006/picture">
+                <pic:pic>
+                  <pic:nvPicPr>
+                    <pic:cNvPr descr="guide/images/06-cp-entra-form.png" id="31" name="Picture"/>
+                    <pic:cNvPicPr>
+                      <a:picLocks noChangeArrowheads="1" noChangeAspect="1"/>
+                    </pic:cNvPicPr>
+                  </pic:nvPicPr>
+                  <pic:blipFill>
+                    <a:blip r:embed="rId29"/>
+                    <a:stretch>
+                      <a:fillRect/>
+                    </a:stretch>
+                  </pic:blipFill>
+                  <pic:spPr bwMode="auto">
+                    <a:xfrm>
+                      <a:off x="0" y="0"/>
+                      <a:ext cx="5334000" cy="3227070"/>
+                    </a:xfrm>
+                    <a:prstGeom prst="rect">
+                      <a:avLst/>
+                    </a:prstGeom>
+                    <a:noFill/>
+                    <a:ln w="9525">
+                      <a:noFill/>
+                      <a:headEnd/>
+                      <a:tailEnd/>
+                    </a:ln>
+                  </pic:spPr>
+                </pic:pic>
+              </a:graphicData>
+            </a:graphic>
+          </wp:inline>
+        </w:drawing>
+      </w:r>
+    </w:p>
+    <w:p>
+      <w:pPr>
+        <w:pStyle w:val="ImageCaption"/>
+      </w:pPr>
+      <w:r>
+        <w:t xml:space="preserve">Microsoft Entra ID form with dummy values + SCIM Integration checked</w:t>
+      </w:r>
+    </w:p>
+    <w:bookmarkEnd w:id="32"/>
+    <w:bookmarkStart w:id="36" w:name="generate-the-scim-token"/>
+    <w:p>
+      <w:pPr>
+        <w:pStyle w:val="Heading3"/>
+      </w:pPr>
+      <w:r>
+        <w:t xml:space="preserve">5.4 Generate the SCIM token</w:t>
+      </w:r>
+    </w:p>
+    <w:p>
+      <w:pPr>
+        <w:pStyle w:val="FirstParagraph"/>
+      </w:pPr>
+      <w:r>
+        <w:t xml:space="preserve">Back on the Identity Providers page, you’ll now see:</w:t>
+      </w:r>
+    </w:p>
+    <w:p>
+      <w:pPr>
+        <w:pStyle w:val="Compact"/>
+        <w:numPr>
+          <w:ilvl w:val="0"/>
+          <w:numId w:val="1007"/>
+        </w:numPr>
+      </w:pPr>
+      <w:r>
+        <w:t xml:space="preserve">Microsoft Entra ID listed with your domain</w:t>
+      </w:r>
+    </w:p>
+    <w:p>
+      <w:pPr>
+        <w:pStyle w:val="Compact"/>
+        <w:numPr>
+          <w:ilvl w:val="0"/>
+          <w:numId w:val="1007"/>
+        </w:numPr>
+      </w:pPr>
+      <w:r>
+        <w:t xml:space="preserve">A green toggle (enabled)</w:t>
+      </w:r>
+    </w:p>
+    <w:p>
+      <w:pPr>
+        <w:pStyle w:val="Compact"/>
+        <w:numPr>
+          <w:ilvl w:val="0"/>
+          <w:numId w:val="1007"/>
+        </w:numPr>
+      </w:pPr>
+      <w:r>
+        <w:rPr>
+          <w:b/>
+          <w:bCs/>
+        </w:rPr>
+        <w:t xml:space="preserve">SCIM Integration: On</w:t>
+      </w:r>
+    </w:p>
+    <w:p>
+      <w:pPr>
+        <w:pStyle w:val="Compact"/>
+        <w:numPr>
+          <w:ilvl w:val="0"/>
+          <w:numId w:val="1007"/>
+        </w:numPr>
+      </w:pPr>
+      <w:r>
+        <w:t xml:space="preserve">A</w:t>
+      </w:r>
+      <w:r>
+        <w:t xml:space="preserve"> </w:t>
+      </w:r>
+      <w:r>
+        <w:rPr>
+          <w:b/>
+          <w:bCs/>
+        </w:rPr>
+        <w:t xml:space="preserve">Settings</w:t>
+      </w:r>
+      <w:r>
+        <w:t xml:space="preserve"> </w:t>
+      </w:r>
+      <w:r>
+        <w:t xml:space="preserve">link</w:t>
+      </w:r>
+    </w:p>
+    <w:p>
+      <w:pPr>
+        <w:pStyle w:val="CaptionedFigure"/>
+      </w:pPr>
+      <w:r>
+        <w:drawing>
+          <wp:inline>
+            <wp:extent cx="5334000" cy="2739009"/>
+            <wp:effectExtent b="0" l="0" r="0" t="0"/>
+            <wp:docPr descr="Identity Providers showing Microsoft Entra ID with SCIM Integration On" title="" id="34" name="Picture"/>
+            <a:graphic>
+              <a:graphicData uri="http://schemas.openxmlformats.org/drawingml/2006/picture">
+                <pic:pic>
+                  <pic:nvPicPr>
+                    <pic:cNvPr descr="guide/images/07-cp-idp-added.png" id="35" name="Picture"/>
+                    <pic:cNvPicPr>
+                      <a:picLocks noChangeArrowheads="1" noChangeAspect="1"/>
+                    </pic:cNvPicPr>
+                  </pic:nvPicPr>
+                  <pic:blipFill>
+                    <a:blip r:embed="rId33"/>
+                    <a:stretch>
+                      <a:fillRect/>
+                    </a:stretch>
+                  </pic:blipFill>
+                  <pic:spPr bwMode="auto">
+                    <a:xfrm>
+                      <a:off x="0" y="0"/>
+                      <a:ext cx="5334000" cy="2739009"/>
+                    </a:xfrm>
+                    <a:prstGeom prst="rect">
+                      <a:avLst/>
+                    </a:prstGeom>
+                    <a:noFill/>
+                    <a:ln w="9525">
+                      <a:noFill/>
+                      <a:headEnd/>
+                      <a:tailEnd/>
+                    </a:ln>
+                  </pic:spPr>
+                </pic:pic>
+              </a:graphicData>
+            </a:graphic>
+          </wp:inline>
+        </w:drawing>
+      </w:r>
+    </w:p>
+    <w:p>
+      <w:pPr>
+        <w:pStyle w:val="ImageCaption"/>
+      </w:pPr>
+      <w:r>
+        <w:t xml:space="preserve">Identity Providers showing Microsoft Entra ID with SCIM Integration On</w:t>
+      </w:r>
+    </w:p>
+    <w:p>
+      <w:pPr>
+        <w:pStyle w:val="BodyText"/>
+      </w:pPr>
+      <w:r>
+        <w:t xml:space="preserve">Click</w:t>
+      </w:r>
+      <w:r>
+        <w:t xml:space="preserve"> </w:t>
+      </w:r>
+      <w:r>
+        <w:rPr>
+          <w:b/>
+          <w:bCs/>
+        </w:rPr>
+        <w:t xml:space="preserve">Settings</w:t>
+      </w:r>
+      <w:r>
+        <w:t xml:space="preserve"> </w:t>
+      </w:r>
+      <w:r>
+        <w:t xml:space="preserve">next to SCIM Integration. This opens a panel with:</w:t>
+      </w:r>
+    </w:p>
+    <w:p>
+      <w:pPr>
+        <w:pStyle w:val="Compact"/>
+        <w:numPr>
+          <w:ilvl w:val="0"/>
+          <w:numId w:val="1008"/>
+        </w:numPr>
+      </w:pPr>
+      <w:r>
+        <w:rPr>
+          <w:b/>
+          <w:bCs/>
+        </w:rPr>
+        <w:t xml:space="preserve">Tenant URL</w:t>
+      </w:r>
+      <w:r>
+        <w:t xml:space="preserve"> </w:t>
+      </w:r>
+      <w:r>
+        <w:t xml:space="preserve">— the base URL for SCIM pushes (e.g. </w:t>
+      </w:r>
+      <w:r>
+        <w:rPr>
+          <w:rStyle w:val="VerbatimChar"/>
+        </w:rPr>
+        <w:t xml:space="preserve">https://api.perimeter81.com/api/scim</w:t>
+      </w:r>
+      <w:r>
+        <w:t xml:space="preserve"> </w:t>
+      </w:r>
+      <w:r>
+        <w:t xml:space="preserve">for the US region, or your regional equivalent)</w:t>
+      </w:r>
+    </w:p>
+    <w:p>
+      <w:pPr>
+        <w:pStyle w:val="Compact"/>
+        <w:numPr>
+          <w:ilvl w:val="0"/>
+          <w:numId w:val="1008"/>
+        </w:numPr>
+      </w:pPr>
+      <w:r>
+        <w:rPr>
+          <w:b/>
+          <w:bCs/>
+        </w:rPr>
+        <w:t xml:space="preserve">Generate Token</w:t>
+      </w:r>
+      <w:r>
+        <w:t xml:space="preserve"> </w:t>
+      </w:r>
+      <w:r>
+        <w:t xml:space="preserve">button</w:t>
+      </w:r>
+    </w:p>
+    <w:p>
+      <w:pPr>
+        <w:pStyle w:val="FirstParagraph"/>
+      </w:pPr>
+      <w:r>
+        <w:t xml:space="preserve">Click</w:t>
+      </w:r>
+      <w:r>
+        <w:t xml:space="preserve"> </w:t>
+      </w:r>
+      <w:r>
+        <w:rPr>
+          <w:b/>
+          <w:bCs/>
+        </w:rPr>
+        <w:t xml:space="preserve">Generate Token</w:t>
+      </w:r>
+      <w:r>
+        <w:t xml:space="preserve">. Check Point SASE shows the bearer token</w:t>
+      </w:r>
+      <w:r>
+        <w:t xml:space="preserve"> </w:t>
+      </w:r>
+      <w:r>
+        <w:rPr>
+          <w:b/>
+          <w:bCs/>
+        </w:rPr>
+        <w:t xml:space="preserve">once</w:t>
+      </w:r>
+      <w:r>
+        <w:t xml:space="preserve">.</w:t>
+      </w:r>
+      <w:r>
+        <w:t xml:space="preserve"> </w:t>
+      </w:r>
+      <w:r>
+        <w:rPr>
+          <w:b/>
+          <w:bCs/>
+        </w:rPr>
+        <w:t xml:space="preserve">Copy it immediately</w:t>
+      </w:r>
+      <w:r>
+        <w:t xml:space="preserve"> </w:t>
+      </w:r>
+      <w:r>
+        <w:t xml:space="preserve">and paste it somewhere safe (1Password, password manager).</w:t>
+      </w:r>
+    </w:p>
     <w:tbl>
       <w:tblPr>
         <w:tblStyle w:val="FigureTable"/>
@@ -2317,288 +2687,6 @@
               <w:jc w:val="center"/>
             </w:pPr>
             <w:r>
-              <w:t xml:space="preserve">Microsoft Entra ID form with dummy values + SCIM Integration checked</w:t>
-            </w:r>
-          </w:p>
-        </w:tc>
-      </w:tr>
-    </w:tbl>
-    <w:p>
-      <w:pPr>
-        <w:pStyle w:val="ImageCaption"/>
-      </w:pPr>
-      <w:r>
-        <w:t xml:space="preserve">Microsoft Entra ID form with dummy values + SCIM Integration checked</w:t>
-      </w:r>
-    </w:p>
-    <w:bookmarkEnd w:id="23"/>
-    <w:bookmarkStart w:id="24" w:name="generate-the-scim-token"/>
-    <w:p>
-      <w:pPr>
-        <w:pStyle w:val="Heading3"/>
-      </w:pPr>
-      <w:r>
-        <w:t xml:space="preserve">5.4 Generate the SCIM token</w:t>
-      </w:r>
-    </w:p>
-    <w:p>
-      <w:pPr>
-        <w:pStyle w:val="FirstParagraph"/>
-      </w:pPr>
-      <w:r>
-        <w:t xml:space="preserve">Back on the Identity Providers page, you’ll now see:</w:t>
-      </w:r>
-    </w:p>
-    <w:p>
-      <w:pPr>
-        <w:pStyle w:val="Compact"/>
-        <w:numPr>
-          <w:ilvl w:val="0"/>
-          <w:numId w:val="1007"/>
-        </w:numPr>
-      </w:pPr>
-      <w:r>
-        <w:t xml:space="preserve">Microsoft Entra ID listed with your domain</w:t>
-      </w:r>
-    </w:p>
-    <w:p>
-      <w:pPr>
-        <w:pStyle w:val="Compact"/>
-        <w:numPr>
-          <w:ilvl w:val="0"/>
-          <w:numId w:val="1007"/>
-        </w:numPr>
-      </w:pPr>
-      <w:r>
-        <w:t xml:space="preserve">A green toggle (enabled)</w:t>
-      </w:r>
-    </w:p>
-    <w:p>
-      <w:pPr>
-        <w:pStyle w:val="Compact"/>
-        <w:numPr>
-          <w:ilvl w:val="0"/>
-          <w:numId w:val="1007"/>
-        </w:numPr>
-      </w:pPr>
-      <w:r>
-        <w:rPr>
-          <w:b/>
-          <w:bCs/>
-        </w:rPr>
-        <w:t xml:space="preserve">SCIM Integration: On</w:t>
-      </w:r>
-    </w:p>
-    <w:p>
-      <w:pPr>
-        <w:pStyle w:val="Compact"/>
-        <w:numPr>
-          <w:ilvl w:val="0"/>
-          <w:numId w:val="1007"/>
-        </w:numPr>
-      </w:pPr>
-      <w:r>
-        <w:t xml:space="preserve">A</w:t>
-      </w:r>
-      <w:r>
-        <w:t xml:space="preserve"> </w:t>
-      </w:r>
-      <w:r>
-        <w:rPr>
-          <w:b/>
-          <w:bCs/>
-        </w:rPr>
-        <w:t xml:space="preserve">Settings</w:t>
-      </w:r>
-      <w:r>
-        <w:t xml:space="preserve"> </w:t>
-      </w:r>
-      <w:r>
-        <w:t xml:space="preserve">link</w:t>
-      </w:r>
-    </w:p>
-    <w:tbl>
-      <w:tblPr>
-        <w:tblStyle w:val="FigureTable"/>
-        <w:tblW w:type="auto" w:w="0"/>
-        <w:jc w:val="center"/>
-        <w:tblLook w:firstRow="0" w:lastRow="0" w:firstColumn="0" w:lastColumn="0"/>
-      </w:tblPr>
-      <w:tblGrid>
-        <w:gridCol w:w="7920"/>
-      </w:tblGrid>
-      <w:tr>
-        <w:tc>
-          <w:tcPr/>
-          <w:p>
-            <w:pPr>
-              <w:pStyle w:val="Compact"/>
-              <w:jc w:val="center"/>
-            </w:pPr>
-            <w:r>
-              <w:t xml:space="preserve">Identity Providers showing Microsoft Entra ID with SCIM Integration On</w:t>
-            </w:r>
-          </w:p>
-        </w:tc>
-      </w:tr>
-    </w:tbl>
-    <w:p>
-      <w:pPr>
-        <w:pStyle w:val="ImageCaption"/>
-      </w:pPr>
-      <w:r>
-        <w:t xml:space="preserve">Identity Providers showing Microsoft Entra ID with SCIM Integration On</w:t>
-      </w:r>
-    </w:p>
-    <w:p>
-      <w:pPr>
-        <w:pStyle w:val="BodyText"/>
-      </w:pPr>
-      <w:r>
-        <w:t xml:space="preserve">Click</w:t>
-      </w:r>
-      <w:r>
-        <w:t xml:space="preserve"> </w:t>
-      </w:r>
-      <w:r>
-        <w:rPr>
-          <w:b/>
-          <w:bCs/>
-        </w:rPr>
-        <w:t xml:space="preserve">Settings</w:t>
-      </w:r>
-      <w:r>
-        <w:t xml:space="preserve"> </w:t>
-      </w:r>
-      <w:r>
-        <w:t xml:space="preserve">next to SCIM Integration. This opens a panel with:</w:t>
-      </w:r>
-    </w:p>
-    <w:p>
-      <w:pPr>
-        <w:pStyle w:val="Compact"/>
-        <w:numPr>
-          <w:ilvl w:val="0"/>
-          <w:numId w:val="1008"/>
-        </w:numPr>
-      </w:pPr>
-      <w:r>
-        <w:rPr>
-          <w:b/>
-          <w:bCs/>
-        </w:rPr>
-        <w:t xml:space="preserve">Tenant URL</w:t>
-      </w:r>
-      <w:r>
-        <w:t xml:space="preserve"> </w:t>
-      </w:r>
-      <w:r>
-        <w:t xml:space="preserve">— the base URL for SCIM pushes (e.g. </w:t>
-      </w:r>
-      <w:r>
-        <w:rPr>
-          <w:rStyle w:val="VerbatimChar"/>
-        </w:rPr>
-        <w:t xml:space="preserve">https://api.perimeter81.com/api/scim</w:t>
-      </w:r>
-      <w:r>
-        <w:t xml:space="preserve"> </w:t>
-      </w:r>
-      <w:r>
-        <w:t xml:space="preserve">for the US region, or your regional equivalent)</w:t>
-      </w:r>
-    </w:p>
-    <w:p>
-      <w:pPr>
-        <w:pStyle w:val="Compact"/>
-        <w:numPr>
-          <w:ilvl w:val="0"/>
-          <w:numId w:val="1008"/>
-        </w:numPr>
-      </w:pPr>
-      <w:r>
-        <w:rPr>
-          <w:b/>
-          <w:bCs/>
-        </w:rPr>
-        <w:t xml:space="preserve">Generate Token</w:t>
-      </w:r>
-      <w:r>
-        <w:t xml:space="preserve"> </w:t>
-      </w:r>
-      <w:r>
-        <w:t xml:space="preserve">button</w:t>
-      </w:r>
-    </w:p>
-    <w:p>
-      <w:pPr>
-        <w:pStyle w:val="FirstParagraph"/>
-      </w:pPr>
-      <w:r>
-        <w:t xml:space="preserve">Click</w:t>
-      </w:r>
-      <w:r>
-        <w:t xml:space="preserve"> </w:t>
-      </w:r>
-      <w:r>
-        <w:rPr>
-          <w:b/>
-          <w:bCs/>
-        </w:rPr>
-        <w:t xml:space="preserve">Generate Token</w:t>
-      </w:r>
-      <w:r>
-        <w:t xml:space="preserve">. Check Point SASE shows the bearer token</w:t>
-      </w:r>
-      <w:r>
-        <w:t xml:space="preserve"> </w:t>
-      </w:r>
-      <w:r>
-        <w:rPr>
-          <w:b/>
-          <w:bCs/>
-        </w:rPr>
-        <w:t xml:space="preserve">once</w:t>
-      </w:r>
-      <w:r>
-        <w:t xml:space="preserve">.</w:t>
-      </w:r>
-      <w:r>
-        <w:t xml:space="preserve"> </w:t>
-      </w:r>
-      <w:r>
-        <w:rPr>
-          <w:b/>
-          <w:bCs/>
-        </w:rPr>
-        <w:t xml:space="preserve">Copy it immediately</w:t>
-      </w:r>
-      <w:r>
-        <w:t xml:space="preserve"> </w:t>
-      </w:r>
-      <w:r>
-        <w:t xml:space="preserve">and paste it somewhere safe (1Password, password manager).</w:t>
-      </w:r>
-    </w:p>
-    <w:tbl>
-      <w:tblPr>
-        <w:tblStyle w:val="FigureTable"/>
-        <w:tblW w:type="auto" w:w="0"/>
-        <w:jc w:val="center"/>
-        <w:tblLook w:firstRow="0" w:lastRow="0" w:firstColumn="0" w:lastColumn="0"/>
-      </w:tblPr>
-      <w:tblGrid>
-        <w:gridCol w:w="7920"/>
-      </w:tblGrid>
-      <w:tr>
-        <w:tc>
-          <w:tcPr/>
-          <w:p>
-            <w:pPr>
-              <w:pStyle w:val="Compact"/>
-              <w:jc w:val="center"/>
-            </w:pPr>
-            <w:r>
               <w:t xml:space="preserve">SCIM Settings panel with Tenant URL and Generate Token button</w:t>
             </w:r>
           </w:p>
@@ -2681,9 +2769,9 @@
         </w:pict>
       </w:r>
     </w:p>
-    <w:bookmarkEnd w:id="24"/>
-    <w:bookmarkEnd w:id="25"/>
-    <w:bookmarkStart w:id="29" w:name="X27a6d757ec024ad2b4831da6b137e5973c62767"/>
+    <w:bookmarkEnd w:id="36"/>
+    <w:bookmarkEnd w:id="37"/>
+    <w:bookmarkStart w:id="44" w:name="X27a6d757ec024ad2b4831da6b137e5973c62767"/>
     <w:p>
       <w:pPr>
         <w:pStyle w:val="Heading2"/>
@@ -2700,7 +2788,7 @@
         <w:t xml:space="preserve">Now wire the simulator to push to that endpoint.</w:t>
       </w:r>
     </w:p>
-    <w:bookmarkStart w:id="26" w:name="open-the-scim-admin-ui"/>
+    <w:bookmarkStart w:id="41" w:name="open-the-scim-admin-ui"/>
     <w:p>
       <w:pPr>
         <w:pStyle w:val="Heading3"/>
@@ -2820,31 +2908,53 @@
         <w:t xml:space="preserve">.</w:t>
       </w:r>
     </w:p>
-    <w:tbl>
-      <w:tblPr>
-        <w:tblStyle w:val="FigureTable"/>
-        <w:tblW w:type="auto" w:w="0"/>
-        <w:jc w:val="center"/>
-        <w:tblLook w:firstRow="0" w:lastRow="0" w:firstColumn="0" w:lastColumn="0"/>
-      </w:tblPr>
-      <w:tblGrid>
-        <w:gridCol w:w="7920"/>
-      </w:tblGrid>
-      <w:tr>
-        <w:tc>
-          <w:tcPr/>
-          <w:p>
-            <w:pPr>
-              <w:pStyle w:val="Compact"/>
-              <w:jc w:val="center"/>
-            </w:pPr>
-            <w:r>
-              <w:t xml:space="preserve">Simulator admin nav with SCIM dropdown open</w:t>
-            </w:r>
-          </w:p>
-        </w:tc>
-      </w:tr>
-    </w:tbl>
+    <w:p>
+      <w:pPr>
+        <w:pStyle w:val="CaptionedFigure"/>
+      </w:pPr>
+      <w:r>
+        <w:drawing>
+          <wp:inline>
+            <wp:extent cx="5334000" cy="2352294"/>
+            <wp:effectExtent b="0" l="0" r="0" t="0"/>
+            <wp:docPr descr="Simulator admin nav with SCIM dropdown open" title="" id="39" name="Picture"/>
+            <a:graphic>
+              <a:graphicData uri="http://schemas.openxmlformats.org/drawingml/2006/picture">
+                <pic:pic>
+                  <pic:nvPicPr>
+                    <pic:cNvPr descr="guide/images/09-sim-scim-nav.png" id="40" name="Picture"/>
+                    <pic:cNvPicPr>
+                      <a:picLocks noChangeArrowheads="1" noChangeAspect="1"/>
+                    </pic:cNvPicPr>
+                  </pic:nvPicPr>
+                  <pic:blipFill>
+                    <a:blip r:embed="rId38"/>
+                    <a:stretch>
+                      <a:fillRect/>
+                    </a:stretch>
+                  </pic:blipFill>
+                  <pic:spPr bwMode="auto">
+                    <a:xfrm>
+                      <a:off x="0" y="0"/>
+                      <a:ext cx="5334000" cy="2352294"/>
+                    </a:xfrm>
+                    <a:prstGeom prst="rect">
+                      <a:avLst/>
+                    </a:prstGeom>
+                    <a:noFill/>
+                    <a:ln w="9525">
+                      <a:noFill/>
+                      <a:headEnd/>
+                      <a:tailEnd/>
+                    </a:ln>
+                  </pic:spPr>
+                </pic:pic>
+              </a:graphicData>
+            </a:graphic>
+          </wp:inline>
+        </w:drawing>
+      </w:r>
+    </w:p>
     <w:p>
       <w:pPr>
         <w:pStyle w:val="ImageCaption"/>
@@ -2853,8 +2963,8 @@
         <w:t xml:space="preserve">Simulator admin nav with SCIM dropdown open</w:t>
       </w:r>
     </w:p>
-    <w:bookmarkEnd w:id="26"/>
-    <w:bookmarkStart w:id="27" w:name="add-the-target"/>
+    <w:bookmarkEnd w:id="41"/>
+    <w:bookmarkStart w:id="42" w:name="add-the-target"/>
     <w:p>
       <w:pPr>
         <w:pStyle w:val="Heading3"/>
@@ -3086,8 +3196,8 @@
         <w:t xml:space="preserve">Add SCIM Target form with US region preset clicked</w:t>
       </w:r>
     </w:p>
-    <w:bookmarkEnd w:id="27"/>
-    <w:bookmarkStart w:id="28" w:name="test-the-connection"/>
+    <w:bookmarkEnd w:id="42"/>
+    <w:bookmarkStart w:id="43" w:name="test-the-connection"/>
     <w:p>
       <w:pPr>
         <w:pStyle w:val="Heading3"/>
@@ -3242,9 +3352,9 @@
         </w:pict>
       </w:r>
     </w:p>
-    <w:bookmarkEnd w:id="28"/>
-    <w:bookmarkEnd w:id="29"/>
-    <w:bookmarkStart w:id="33" w:name="sync-users-and-verify"/>
+    <w:bookmarkEnd w:id="43"/>
+    <w:bookmarkEnd w:id="44"/>
+    <w:bookmarkStart w:id="57" w:name="sync-users-and-verify"/>
     <w:p>
       <w:pPr>
         <w:pStyle w:val="Heading2"/>
@@ -3253,7 +3363,7 @@
         <w:t xml:space="preserve">7. Sync users and verify</w:t>
       </w:r>
     </w:p>
-    <w:bookmarkStart w:id="30" w:name="push-all-users"/>
+    <w:bookmarkStart w:id="48" w:name="push-all-users"/>
     <w:p>
       <w:pPr>
         <w:pStyle w:val="Heading3"/>
@@ -3310,31 +3420,53 @@
         <w:t xml:space="preserve">Numbers will vary based on whether the demo users already exist on the Check Point SASE side.</w:t>
       </w:r>
     </w:p>
-    <w:tbl>
-      <w:tblPr>
-        <w:tblStyle w:val="FigureTable"/>
-        <w:tblW w:type="auto" w:w="0"/>
-        <w:jc w:val="center"/>
-        <w:tblLook w:firstRow="0" w:lastRow="0" w:firstColumn="0" w:lastColumn="0"/>
-      </w:tblPr>
-      <w:tblGrid>
-        <w:gridCol w:w="7920"/>
-      </w:tblGrid>
-      <w:tr>
-        <w:tc>
-          <w:tcPr/>
-          <w:p>
-            <w:pPr>
-              <w:pStyle w:val="Compact"/>
-              <w:jc w:val="center"/>
-            </w:pPr>
-            <w:r>
-              <w:t xml:space="preserve">Sync success banner on Outbound Targets page</w:t>
-            </w:r>
-          </w:p>
-        </w:tc>
-      </w:tr>
-    </w:tbl>
+    <w:p>
+      <w:pPr>
+        <w:pStyle w:val="CaptionedFigure"/>
+      </w:pPr>
+      <w:r>
+        <w:drawing>
+          <wp:inline>
+            <wp:extent cx="5334000" cy="2514981"/>
+            <wp:effectExtent b="0" l="0" r="0" t="0"/>
+            <wp:docPr descr="Sync success banner on Outbound Targets page" title="" id="46" name="Picture"/>
+            <a:graphic>
+              <a:graphicData uri="http://schemas.openxmlformats.org/drawingml/2006/picture">
+                <pic:pic>
+                  <pic:nvPicPr>
+                    <pic:cNvPr descr="guide/images/11-sim-sync-success.png" id="47" name="Picture"/>
+                    <pic:cNvPicPr>
+                      <a:picLocks noChangeArrowheads="1" noChangeAspect="1"/>
+                    </pic:cNvPicPr>
+                  </pic:nvPicPr>
+                  <pic:blipFill>
+                    <a:blip r:embed="rId45"/>
+                    <a:stretch>
+                      <a:fillRect/>
+                    </a:stretch>
+                  </pic:blipFill>
+                  <pic:spPr bwMode="auto">
+                    <a:xfrm>
+                      <a:off x="0" y="0"/>
+                      <a:ext cx="5334000" cy="2514981"/>
+                    </a:xfrm>
+                    <a:prstGeom prst="rect">
+                      <a:avLst/>
+                    </a:prstGeom>
+                    <a:noFill/>
+                    <a:ln w="9525">
+                      <a:noFill/>
+                      <a:headEnd/>
+                      <a:tailEnd/>
+                    </a:ln>
+                  </pic:spPr>
+                </pic:pic>
+              </a:graphicData>
+            </a:graphic>
+          </wp:inline>
+        </w:drawing>
+      </w:r>
+    </w:p>
     <w:p>
       <w:pPr>
         <w:pStyle w:val="ImageCaption"/>
@@ -3343,8 +3475,8 @@
         <w:t xml:space="preserve">Sync success banner on Outbound Targets page</w:t>
       </w:r>
     </w:p>
-    <w:bookmarkEnd w:id="30"/>
-    <w:bookmarkStart w:id="31" w:name="inspect-the-push-log"/>
+    <w:bookmarkEnd w:id="48"/>
+    <w:bookmarkStart w:id="52" w:name="inspect-the-push-log"/>
     <w:p>
       <w:pPr>
         <w:pStyle w:val="Heading3"/>
@@ -3452,31 +3584,53 @@
         <w:t xml:space="preserve">with full request and response bodies if you click the eye icon</w:t>
       </w:r>
     </w:p>
-    <w:tbl>
-      <w:tblPr>
-        <w:tblStyle w:val="FigureTable"/>
-        <w:tblW w:type="auto" w:w="0"/>
-        <w:jc w:val="center"/>
-        <w:tblLook w:firstRow="0" w:lastRow="0" w:firstColumn="0" w:lastColumn="0"/>
-      </w:tblPr>
-      <w:tblGrid>
-        <w:gridCol w:w="7920"/>
-      </w:tblGrid>
-      <w:tr>
-        <w:tc>
-          <w:tcPr/>
-          <w:p>
-            <w:pPr>
-              <w:pStyle w:val="Compact"/>
-              <w:jc w:val="center"/>
-            </w:pPr>
-            <w:r>
-              <w:t xml:space="preserve">SCIM Push Log with CREATE/FIND/PATCH entries and HTTP status badges</w:t>
-            </w:r>
-          </w:p>
-        </w:tc>
-      </w:tr>
-    </w:tbl>
+    <w:p>
+      <w:pPr>
+        <w:pStyle w:val="CaptionedFigure"/>
+      </w:pPr>
+      <w:r>
+        <w:drawing>
+          <wp:inline>
+            <wp:extent cx="5334000" cy="2389632"/>
+            <wp:effectExtent b="0" l="0" r="0" t="0"/>
+            <wp:docPr descr="SCIM Push Log with CREATE/FIND/PATCH entries and HTTP status badges" title="" id="50" name="Picture"/>
+            <a:graphic>
+              <a:graphicData uri="http://schemas.openxmlformats.org/drawingml/2006/picture">
+                <pic:pic>
+                  <pic:nvPicPr>
+                    <pic:cNvPr descr="guide/images/12-sim-push-log.png" id="51" name="Picture"/>
+                    <pic:cNvPicPr>
+                      <a:picLocks noChangeArrowheads="1" noChangeAspect="1"/>
+                    </pic:cNvPicPr>
+                  </pic:nvPicPr>
+                  <pic:blipFill>
+                    <a:blip r:embed="rId49"/>
+                    <a:stretch>
+                      <a:fillRect/>
+                    </a:stretch>
+                  </pic:blipFill>
+                  <pic:spPr bwMode="auto">
+                    <a:xfrm>
+                      <a:off x="0" y="0"/>
+                      <a:ext cx="5334000" cy="2389632"/>
+                    </a:xfrm>
+                    <a:prstGeom prst="rect">
+                      <a:avLst/>
+                    </a:prstGeom>
+                    <a:noFill/>
+                    <a:ln w="9525">
+                      <a:noFill/>
+                      <a:headEnd/>
+                      <a:tailEnd/>
+                    </a:ln>
+                  </pic:spPr>
+                </pic:pic>
+              </a:graphicData>
+            </a:graphic>
+          </wp:inline>
+        </w:drawing>
+      </w:r>
+    </w:p>
     <w:p>
       <w:pPr>
         <w:pStyle w:val="ImageCaption"/>
@@ -3493,8 +3647,8 @@
         <w:t xml:space="preserve">This log is gold for demos — you can show prospects the exact wire-level SCIM requests/responses.</w:t>
       </w:r>
     </w:p>
-    <w:bookmarkEnd w:id="31"/>
-    <w:bookmarkStart w:id="32" w:name="verify-on-check-point-sase"/>
+    <w:bookmarkEnd w:id="52"/>
+    <w:bookmarkStart w:id="56" w:name="verify-on-check-point-sase"/>
     <w:p>
       <w:pPr>
         <w:pStyle w:val="Heading3"/>
@@ -3570,31 +3724,53 @@
         <w:t xml:space="preserve">.</w:t>
       </w:r>
     </w:p>
-    <w:tbl>
-      <w:tblPr>
-        <w:tblStyle w:val="FigureTable"/>
-        <w:tblW w:type="auto" w:w="0"/>
-        <w:jc w:val="center"/>
-        <w:tblLook w:firstRow="0" w:lastRow="0" w:firstColumn="0" w:lastColumn="0"/>
-      </w:tblPr>
-      <w:tblGrid>
-        <w:gridCol w:w="7920"/>
-      </w:tblGrid>
-      <w:tr>
-        <w:tc>
-          <w:tcPr/>
-          <w:p>
-            <w:pPr>
-              <w:pStyle w:val="Compact"/>
-              <w:jc w:val="center"/>
-            </w:pPr>
-            <w:r>
-              <w:t xml:space="preserve">Check Point SASE Members showing synced users with Entra ID source</w:t>
-            </w:r>
-          </w:p>
-        </w:tc>
-      </w:tr>
-    </w:tbl>
+    <w:p>
+      <w:pPr>
+        <w:pStyle w:val="CaptionedFigure"/>
+      </w:pPr>
+      <w:r>
+        <w:drawing>
+          <wp:inline>
+            <wp:extent cx="5334000" cy="2709672"/>
+            <wp:effectExtent b="0" l="0" r="0" t="0"/>
+            <wp:docPr descr="Check Point SASE Members showing synced users with Entra ID source" title="" id="54" name="Picture"/>
+            <a:graphic>
+              <a:graphicData uri="http://schemas.openxmlformats.org/drawingml/2006/picture">
+                <pic:pic>
+                  <pic:nvPicPr>
+                    <pic:cNvPr descr="guide/images/13-cp-members-synced.png" id="55" name="Picture"/>
+                    <pic:cNvPicPr>
+                      <a:picLocks noChangeArrowheads="1" noChangeAspect="1"/>
+                    </pic:cNvPicPr>
+                  </pic:nvPicPr>
+                  <pic:blipFill>
+                    <a:blip r:embed="rId53"/>
+                    <a:stretch>
+                      <a:fillRect/>
+                    </a:stretch>
+                  </pic:blipFill>
+                  <pic:spPr bwMode="auto">
+                    <a:xfrm>
+                      <a:off x="0" y="0"/>
+                      <a:ext cx="5334000" cy="2709672"/>
+                    </a:xfrm>
+                    <a:prstGeom prst="rect">
+                      <a:avLst/>
+                    </a:prstGeom>
+                    <a:noFill/>
+                    <a:ln w="9525">
+                      <a:noFill/>
+                      <a:headEnd/>
+                      <a:tailEnd/>
+                    </a:ln>
+                  </pic:spPr>
+                </pic:pic>
+              </a:graphicData>
+            </a:graphic>
+          </wp:inline>
+        </w:drawing>
+      </w:r>
+    </w:p>
     <w:p>
       <w:pPr>
         <w:pStyle w:val="ImageCaption"/>
@@ -3618,9 +3794,9 @@
         </w:pict>
       </w:r>
     </w:p>
-    <w:bookmarkEnd w:id="32"/>
-    <w:bookmarkEnd w:id="33"/>
-    <w:bookmarkStart w:id="34" w:name="optional-auto-sync-on-admin-changes"/>
+    <w:bookmarkEnd w:id="56"/>
+    <w:bookmarkEnd w:id="57"/>
+    <w:bookmarkStart w:id="58" w:name="optional-auto-sync-on-admin-changes"/>
     <w:p>
       <w:pPr>
         <w:pStyle w:val="Heading2"/>
@@ -3683,8 +3859,8 @@
         </w:pict>
       </w:r>
     </w:p>
-    <w:bookmarkEnd w:id="34"/>
-    <w:bookmarkStart w:id="38" w:name="X1bea4b329b058b905be5fc93bd4f8082948df48"/>
+    <w:bookmarkEnd w:id="58"/>
+    <w:bookmarkStart w:id="62" w:name="X1bea4b329b058b905be5fc93bd4f8082948df48"/>
     <w:p>
       <w:pPr>
         <w:pStyle w:val="Heading2"/>
@@ -3732,7 +3908,7 @@
         <w:t xml:space="preserve">it.</w:t>
       </w:r>
     </w:p>
-    <w:bookmarkStart w:id="35" w:name="bearer-token"/>
+    <w:bookmarkStart w:id="59" w:name="bearer-token"/>
     <w:p>
       <w:pPr>
         <w:pStyle w:val="Heading3"/>
@@ -3762,8 +3938,8 @@
         <w:t xml:space="preserve">.</w:t>
       </w:r>
     </w:p>
-    <w:bookmarkEnd w:id="35"/>
-    <w:bookmarkStart w:id="36" w:name="endpoint-url"/>
+    <w:bookmarkEnd w:id="59"/>
+    <w:bookmarkStart w:id="60" w:name="endpoint-url"/>
     <w:p>
       <w:pPr>
         <w:pStyle w:val="Heading3"/>
@@ -3789,8 +3965,8 @@
         <w:t xml:space="preserve">https://idp.&lt;yourdomain&gt;/scim/v2</w:t>
       </w:r>
     </w:p>
-    <w:bookmarkEnd w:id="36"/>
-    <w:bookmarkStart w:id="37" w:name="test-from-your-laptop"/>
+    <w:bookmarkEnd w:id="60"/>
+    <w:bookmarkStart w:id="61" w:name="test-from-your-laptop"/>
     <w:p>
       <w:pPr>
         <w:pStyle w:val="Heading3"/>
@@ -4201,9 +4377,9 @@
         </w:pict>
       </w:r>
     </w:p>
-    <w:bookmarkEnd w:id="37"/>
-    <w:bookmarkEnd w:id="38"/>
-    <w:bookmarkStart w:id="45" w:name="troubleshooting"/>
+    <w:bookmarkEnd w:id="61"/>
+    <w:bookmarkEnd w:id="62"/>
+    <w:bookmarkStart w:id="69" w:name="troubleshooting"/>
     <w:p>
       <w:pPr>
         <w:pStyle w:val="Heading2"/>
@@ -4212,7 +4388,7 @@
         <w:t xml:space="preserve">10. Troubleshooting</w:t>
       </w:r>
     </w:p>
-    <w:bookmarkStart w:id="39" w:name="test-connection-returns-404"/>
+    <w:bookmarkStart w:id="63" w:name="test-connection-returns-404"/>
     <w:p>
       <w:pPr>
         <w:pStyle w:val="Heading3"/>
@@ -4271,8 +4447,8 @@
         <w:t xml:space="preserve">path or wrong region.</w:t>
       </w:r>
     </w:p>
-    <w:bookmarkEnd w:id="39"/>
-    <w:bookmarkStart w:id="40" w:name="test-connection-returns-401"/>
+    <w:bookmarkEnd w:id="63"/>
+    <w:bookmarkStart w:id="64" w:name="test-connection-returns-401"/>
     <w:p>
       <w:pPr>
         <w:pStyle w:val="Heading3"/>
@@ -4305,8 +4481,8 @@
         <w:t xml:space="preserve">(it’ll invalidate the old one and give you a new one). Paste the new token into the simulator’s target (edit the target, paste in the Bearer Token field, save).</w:t>
       </w:r>
     </w:p>
-    <w:bookmarkEnd w:id="40"/>
-    <w:bookmarkStart w:id="41" w:name="X7a2343e38459be1c0486bc2a5b41ac4a4d8f145"/>
+    <w:bookmarkEnd w:id="64"/>
+    <w:bookmarkStart w:id="65" w:name="X7a2343e38459be1c0486bc2a5b41ac4a4d8f145"/>
     <w:p>
       <w:pPr>
         <w:pStyle w:val="Heading3"/>
@@ -4335,8 +4511,8 @@
         <w:t xml:space="preserve">Your Dokploy version isn’t propagating Environment-tab vars into the docker-compose substitution context. Use the marker file fallback (section 4.2).</w:t>
       </w:r>
     </w:p>
-    <w:bookmarkEnd w:id="41"/>
-    <w:bookmarkStart w:id="42" w:name="sync-all-shows-n-errored"/>
+    <w:bookmarkEnd w:id="65"/>
+    <w:bookmarkStart w:id="66" w:name="sync-all-shows-n-errored"/>
     <w:p>
       <w:pPr>
         <w:pStyle w:val="Heading3"/>
@@ -4503,8 +4679,8 @@
         <w:t xml:space="preserve">. Edit the offending user in the simulator and retry.</w:t>
       </w:r>
     </w:p>
-    <w:bookmarkEnd w:id="42"/>
-    <w:bookmarkStart w:id="43" w:name="i-lost-all-my-settings-after-a-redeploy"/>
+    <w:bookmarkEnd w:id="66"/>
+    <w:bookmarkStart w:id="67" w:name="i-lost-all-my-settings-after-a-redeploy"/>
     <w:p>
       <w:pPr>
         <w:pStyle w:val="Heading3"/>
@@ -4548,8 +4724,8 @@
         <w:t xml:space="preserve">. Future redeploys keep all data. If you were on the old build, the first redeploy will migrate your existing DB into the volume automatically.</w:t>
       </w:r>
     </w:p>
-    <w:bookmarkEnd w:id="43"/>
-    <w:bookmarkStart w:id="44" w:name="Xc910c7d73a02c2fe4343ac6ab9a2b81f4a3225c"/>
+    <w:bookmarkEnd w:id="67"/>
+    <w:bookmarkStart w:id="68" w:name="Xc910c7d73a02c2fe4343ac6ab9a2b81f4a3225c"/>
     <w:p>
       <w:pPr>
         <w:pStyle w:val="Heading3"/>
@@ -4652,9 +4828,9 @@
         </w:pict>
       </w:r>
     </w:p>
-    <w:bookmarkEnd w:id="44"/>
-    <w:bookmarkEnd w:id="45"/>
-    <w:bookmarkStart w:id="58" w:name="appendix-defaults-and-references"/>
+    <w:bookmarkEnd w:id="68"/>
+    <w:bookmarkEnd w:id="69"/>
+    <w:bookmarkStart w:id="82" w:name="appendix-defaults-and-references"/>
     <w:p>
       <w:pPr>
         <w:pStyle w:val="Heading2"/>
@@ -4663,7 +4839,7 @@
         <w:t xml:space="preserve">11. Appendix: defaults and references</w:t>
       </w:r>
     </w:p>
-    <w:bookmarkStart w:id="46" w:name="default-admin-credentials"/>
+    <w:bookmarkStart w:id="70" w:name="default-admin-credentials"/>
     <w:p>
       <w:pPr>
         <w:pStyle w:val="Heading3"/>
@@ -4802,8 +4978,8 @@
         <w:t xml:space="preserve">in Dokploy.</w:t>
       </w:r>
     </w:p>
-    <w:bookmarkEnd w:id="46"/>
-    <w:bookmarkStart w:id="47" w:name="default-seeded-users-for-demos"/>
+    <w:bookmarkEnd w:id="70"/>
+    <w:bookmarkStart w:id="71" w:name="default-seeded-users-for-demos"/>
     <w:p>
       <w:pPr>
         <w:pStyle w:val="Heading3"/>
@@ -4994,8 +5170,8 @@
         </w:tc>
       </w:tr>
     </w:tbl>
-    <w:bookmarkEnd w:id="47"/>
-    <w:bookmarkStart w:id="48" w:name="default-seeded-saml-sps"/>
+    <w:bookmarkEnd w:id="71"/>
+    <w:bookmarkStart w:id="72" w:name="default-seeded-saml-sps"/>
     <w:p>
       <w:pPr>
         <w:pStyle w:val="Heading3"/>
@@ -5060,8 +5236,8 @@
         <w:t xml:space="preserve">.</w:t>
       </w:r>
     </w:p>
-    <w:bookmarkEnd w:id="48"/>
-    <w:bookmarkStart w:id="49" w:name="X1c58ccaf305799f7b12cfe0a4ce0f237b63e432"/>
+    <w:bookmarkEnd w:id="72"/>
+    <w:bookmarkStart w:id="73" w:name="X1c58ccaf305799f7b12cfe0a4ce0f237b63e432"/>
     <w:p>
       <w:pPr>
         <w:pStyle w:val="Heading3"/>
@@ -5216,8 +5392,8 @@
         </w:tc>
       </w:tr>
     </w:tbl>
-    <w:bookmarkEnd w:id="49"/>
-    <w:bookmarkStart w:id="50" w:name="env-vars-worth-knowing"/>
+    <w:bookmarkEnd w:id="73"/>
+    <w:bookmarkStart w:id="74" w:name="env-vars-worth-knowing"/>
     <w:p>
       <w:pPr>
         <w:pStyle w:val="Heading3"/>
@@ -5620,8 +5796,8 @@
         </w:tc>
       </w:tr>
     </w:tbl>
-    <w:bookmarkEnd w:id="50"/>
-    <w:bookmarkStart w:id="57" w:name="reference-docs"/>
+    <w:bookmarkEnd w:id="74"/>
+    <w:bookmarkStart w:id="81" w:name="reference-docs"/>
     <w:p>
       <w:pPr>
         <w:pStyle w:val="Heading3"/>
@@ -5638,7 +5814,7 @@
           <w:numId w:val="1012"/>
         </w:numPr>
       </w:pPr>
-      <w:hyperlink r:id="rId51">
+      <w:hyperlink r:id="rId75">
         <w:r>
           <w:rPr>
             <w:rStyle w:val="Hyperlink"/>
@@ -5661,7 +5837,7 @@
           <w:numId w:val="1012"/>
         </w:numPr>
       </w:pPr>
-      <w:hyperlink r:id="rId52">
+      <w:hyperlink r:id="rId76">
         <w:r>
           <w:rPr>
             <w:rStyle w:val="Hyperlink"/>
@@ -5684,7 +5860,7 @@
           <w:numId w:val="1012"/>
         </w:numPr>
       </w:pPr>
-      <w:hyperlink r:id="rId53">
+      <w:hyperlink r:id="rId77">
         <w:r>
           <w:rPr>
             <w:rStyle w:val="Hyperlink"/>
@@ -5707,7 +5883,7 @@
           <w:numId w:val="1012"/>
         </w:numPr>
       </w:pPr>
-      <w:hyperlink r:id="rId54">
+      <w:hyperlink r:id="rId78">
         <w:r>
           <w:rPr>
             <w:rStyle w:val="Hyperlink"/>
@@ -5724,7 +5900,7 @@
           <w:numId w:val="1012"/>
         </w:numPr>
       </w:pPr>
-      <w:hyperlink r:id="rId55">
+      <w:hyperlink r:id="rId79">
         <w:r>
           <w:rPr>
             <w:rStyle w:val="Hyperlink"/>
@@ -5760,7 +5936,7 @@
       <w:r>
         <w:t xml:space="preserve"> </w:t>
       </w:r>
-      <w:hyperlink r:id="rId56">
+      <w:hyperlink r:id="rId80">
         <w:r>
           <w:rPr>
             <w:rStyle w:val="Hyperlink"/>
@@ -5772,9 +5948,9 @@
         <w:t xml:space="preserve">.</w:t>
       </w:r>
     </w:p>
-    <w:bookmarkEnd w:id="57"/>
-    <w:bookmarkEnd w:id="58"/>
-    <w:bookmarkEnd w:id="59"/>
+    <w:bookmarkEnd w:id="81"/>
+    <w:bookmarkEnd w:id="82"/>
+    <w:bookmarkEnd w:id="83"/>
     <w:sectPr>
       <w:footnotePr>
         <w:numRestart w:val="eachSect"/>

</xml_diff>